<commit_message>
Redraw the topology figure as layered rows with no crossing arrows
</commit_message>
<xml_diff>
--- a/docs/scheduler-explained-2026-10-14/WaterFlex_Scheduler_Explained_2026-10-14.docx
+++ b/docs/scheduler-explained-2026-10-14/WaterFlex_Scheduler_Explained_2026-10-14.docx
@@ -2332,8 +2332,8 @@
       <w:r>
         <w:drawing>
           <wp:inline xmlns:a="http://schemas.openxmlformats.org/drawingml/2006/main" xmlns:pic="http://schemas.openxmlformats.org/drawingml/2006/picture">
-            <wp:extent cx="6263640" cy="2714244"/>
-            <wp:docPr id="1" name="Picture 1" descr="Figure 1. The scheduler VM and its host. WaterFlex Software calls one address; behind it a proxy sends booking calls to the booking pool and proposals to the daily pool, each replica embeds the calculation engine, and the VM holds a routing service per metro, an optional Nominatim and the scheduler's own database."/>
+            <wp:extent cx="6263640" cy="2992628"/>
+            <wp:docPr id="1" name="Picture 1" descr="Figure 1. The scheduler VM and its host, top to bottom: the one address WaterFlex Software calls, the two pools of replicas it sends work to, and the three shared pieces every replica reaches (a routing service per metro, an optional Nominatim and the scheduler's own database). Each replica embeds the calculation engine. The management port is on the private network and not behind the proxy."/>
             <wp:cNvGraphicFramePr>
               <a:graphicFrameLocks noChangeAspect="1"/>
             </wp:cNvGraphicFramePr>
@@ -2353,7 +2353,7 @@
                   <pic:spPr>
                     <a:xfrm>
                       <a:off x="0" y="0"/>
-                      <a:ext cx="6263640" cy="2714244"/>
+                      <a:ext cx="6263640" cy="2992628"/>
                     </a:xfrm>
                     <a:prstGeom prst="rect"/>
                   </pic:spPr>
@@ -2376,7 +2376,7 @@
           <w:i/>
           <w:color w:val="000000"/>
         </w:rPr>
-        <w:t>Figure 1. The scheduler VM and its host. WaterFlex Software calls one address; behind it a proxy sends booking calls to the booking pool and proposals to the daily pool, each replica embeds the calculation engine, and the VM holds a routing service per metro, an optional Nominatim and the scheduler's own database.</w:t>
+        <w:t>Figure 1. The scheduler VM and its host, top to bottom: the one address WaterFlex Software calls, the two pools of replicas it sends work to, and the three shared pieces every replica reaches (a routing service per metro, an optional Nominatim and the scheduler's own database). Each replica embeds the calculation engine. The management port is on the private network and not behind the proxy.</w:t>
       </w:r>
     </w:p>
     <w:p>

</xml_diff>

<commit_message>
Author figure 1 as an inline SVG architecture diagram rendered through Playwright
</commit_message>
<xml_diff>
--- a/docs/scheduler-explained-2026-10-14/WaterFlex_Scheduler_Explained_2026-10-14.docx
+++ b/docs/scheduler-explained-2026-10-14/WaterFlex_Scheduler_Explained_2026-10-14.docx
@@ -2332,8 +2332,8 @@
       <w:r>
         <w:drawing>
           <wp:inline xmlns:a="http://schemas.openxmlformats.org/drawingml/2006/main" xmlns:pic="http://schemas.openxmlformats.org/drawingml/2006/picture">
-            <wp:extent cx="6263640" cy="2992628"/>
-            <wp:docPr id="1" name="Picture 1" descr="Figure 1. The scheduler VM and its host, top to bottom: the one address WaterFlex Software calls, the two pools of replicas it sends work to, and the three shared pieces every replica reaches (a routing service per metro, an optional Nominatim and the scheduler's own database). Each replica embeds the calculation engine. The management port is on the private network and not behind the proxy."/>
+            <wp:extent cx="6263640" cy="3058418"/>
+            <wp:docPr id="1" name="Picture 1" descr="Figure 1. The scheduler VM and its host. WaterFlex Software calls one address; behind it the proxy sends booking calls to the booking pool and proposals to the daily pool. Both pools embed the calculation engine and reach the same three shared pieces. The management port is private and not behind the proxy."/>
             <wp:cNvGraphicFramePr>
               <a:graphicFrameLocks noChangeAspect="1"/>
             </wp:cNvGraphicFramePr>
@@ -2353,7 +2353,7 @@
                   <pic:spPr>
                     <a:xfrm>
                       <a:off x="0" y="0"/>
-                      <a:ext cx="6263640" cy="2992628"/>
+                      <a:ext cx="6263640" cy="3058418"/>
                     </a:xfrm>
                     <a:prstGeom prst="rect"/>
                   </pic:spPr>
@@ -2376,7 +2376,7 @@
           <w:i/>
           <w:color w:val="000000"/>
         </w:rPr>
-        <w:t>Figure 1. The scheduler VM and its host, top to bottom: the one address WaterFlex Software calls, the two pools of replicas it sends work to, and the three shared pieces every replica reaches (a routing service per metro, an optional Nominatim and the scheduler's own database). Each replica embeds the calculation engine. The management port is on the private network and not behind the proxy.</w:t>
+        <w:t>Figure 1. The scheduler VM and its host. WaterFlex Software calls one address; behind it the proxy sends booking calls to the booking pool and proposals to the daily pool. Both pools embed the calculation engine and reach the same three shared pieces. The management port is private and not behind the proxy.</w:t>
       </w:r>
     </w:p>
     <w:p>

</xml_diff>

<commit_message>
Redraw figures 2 to 12 as inline SVG diagrams generated from the recorded chart data
</commit_message>
<xml_diff>
--- a/docs/scheduler-explained-2026-10-14/WaterFlex_Scheduler_Explained_2026-10-14.docx
+++ b/docs/scheduler-explained-2026-10-14/WaterFlex_Scheduler_Explained_2026-10-14.docx
@@ -4151,8 +4151,8 @@
       <w:r>
         <w:drawing>
           <wp:inline xmlns:a="http://schemas.openxmlformats.org/drawingml/2006/main" xmlns:pic="http://schemas.openxmlformats.org/drawingml/2006/picture">
-            <wp:extent cx="6263640" cy="2505456"/>
-            <wp:docPr id="2" name="Picture 2" descr="Figure 2. Daily and repair proposals: synchronous or queued, then the commit with the host's current timestamps. The lower left lists the refusals and the cancel."/>
+            <wp:extent cx="6263640" cy="3234583"/>
+            <wp:docPr id="2" name="Picture 2" descr="Figure 2. Daily and repair proposals: synchronous or queued, then the commit with the host's current timestamps. The note on the right lists the refusals and the cancel."/>
             <wp:cNvGraphicFramePr>
               <a:graphicFrameLocks noChangeAspect="1"/>
             </wp:cNvGraphicFramePr>
@@ -4172,7 +4172,7 @@
                   <pic:spPr>
                     <a:xfrm>
                       <a:off x="0" y="0"/>
-                      <a:ext cx="6263640" cy="2505456"/>
+                      <a:ext cx="6263640" cy="3234583"/>
                     </a:xfrm>
                     <a:prstGeom prst="rect"/>
                   </pic:spPr>
@@ -4195,7 +4195,7 @@
           <w:i/>
           <w:color w:val="000000"/>
         </w:rPr>
-        <w:t>Figure 2. Daily and repair proposals: synchronous or queued, then the commit with the host's current timestamps. The lower left lists the refusals and the cancel.</w:t>
+        <w:t>Figure 2. Daily and repair proposals: synchronous or queued, then the commit with the host's current timestamps. The note on the right lists the refusals and the cancel.</w:t>
       </w:r>
     </w:p>
     <w:p>
@@ -4223,7 +4223,7 @@
       <w:r>
         <w:drawing>
           <wp:inline xmlns:a="http://schemas.openxmlformats.org/drawingml/2006/main" xmlns:pic="http://schemas.openxmlformats.org/drawingml/2006/picture">
-            <wp:extent cx="6263640" cy="2505456"/>
+            <wp:extent cx="6263640" cy="3234583"/>
             <wp:docPr id="3" name="Picture 3" descr="Figure 3. The booking sequence and its refusals. Each 409 and a failed receipt write lead to the same place: release the set (or let the hold expire) and search again from current records with a new requestId."/>
             <wp:cNvGraphicFramePr>
               <a:graphicFrameLocks noChangeAspect="1"/>
@@ -4244,7 +4244,7 @@
                   <pic:spPr>
                     <a:xfrm>
                       <a:off x="0" y="0"/>
-                      <a:ext cx="6263640" cy="2505456"/>
+                      <a:ext cx="6263640" cy="3234583"/>
                     </a:xfrm>
                     <a:prstGeom prst="rect"/>
                   </pic:spPr>
@@ -8777,7 +8777,7 @@
       <w:r>
         <w:drawing>
           <wp:inline xmlns:a="http://schemas.openxmlformats.org/drawingml/2006/main" xmlns:pic="http://schemas.openxmlformats.org/drawingml/2006/picture">
-            <wp:extent cx="6263640" cy="2296668"/>
+            <wp:extent cx="6263640" cy="2549497"/>
             <wp:docPr id="4" name="Picture 4" descr="Figure 4. The four route cache tiers in lookup order, from the design document. A pair of coordinates is answered by the first tier that holds it; a leg computed by the routing service is written back to the database and memory tiers in a separate short transaction."/>
             <wp:cNvGraphicFramePr>
               <a:graphicFrameLocks noChangeAspect="1"/>
@@ -8798,7 +8798,7 @@
                   <pic:spPr>
                     <a:xfrm>
                       <a:off x="0" y="0"/>
-                      <a:ext cx="6263640" cy="2296668"/>
+                      <a:ext cx="6263640" cy="2549497"/>
                     </a:xfrm>
                     <a:prstGeom prst="rect"/>
                   </pic:spPr>
@@ -11313,8 +11313,8 @@
       <w:r>
         <w:drawing>
           <wp:inline xmlns:a="http://schemas.openxmlformats.org/drawingml/2006/main" xmlns:pic="http://schemas.openxmlformats.org/drawingml/2006/picture">
-            <wp:extent cx="6263640" cy="2714244"/>
-            <wp:docPr id="5" name="Picture 5" descr="Figure 5. Mean saving against Tabu in modeled dollars per case by fleet size. Left: the Tabu variant study (160 cases per cell). Right: the follow-up on 40 fixtures the first study never saw (48 cases per cell), with the combined Tabu + K opt size 3. Blue saves, orange loses."/>
+            <wp:extent cx="6263640" cy="2745236"/>
+            <wp:docPr id="5" name="Picture 5" descr="Figure 5. Mean saving against Tabu in modeled dollars per case by fleet size. Left: the Tabu variant study (160 cases per cell). Right: the follow-up on 40 fixtures the first study never saw (48 cases per cell), with the combined Tabu + K opt size 3. Blue saves, brown loses, and the green cell is the configuration each study chose."/>
             <wp:cNvGraphicFramePr>
               <a:graphicFrameLocks noChangeAspect="1"/>
             </wp:cNvGraphicFramePr>
@@ -11334,7 +11334,7 @@
                   <pic:spPr>
                     <a:xfrm>
                       <a:off x="0" y="0"/>
-                      <a:ext cx="6263640" cy="2714244"/>
+                      <a:ext cx="6263640" cy="2745236"/>
                     </a:xfrm>
                     <a:prstGeom prst="rect"/>
                   </pic:spPr>
@@ -11357,7 +11357,7 @@
           <w:i/>
           <w:color w:val="000000"/>
         </w:rPr>
-        <w:t>Figure 5. Mean saving against Tabu in modeled dollars per case by fleet size. Left: the Tabu variant study (160 cases per cell). Right: the follow-up on 40 fixtures the first study never saw (48 cases per cell), with the combined Tabu + K opt size 3. Blue saves, orange loses.</w:t>
+        <w:t>Figure 5. Mean saving against Tabu in modeled dollars per case by fleet size. Left: the Tabu variant study (160 cases per cell). Right: the follow-up on 40 fixtures the first study never saw (48 cases per cell), with the combined Tabu + K opt size 3. Blue saves, brown loses, and the green cell is the configuration each study chose.</w:t>
       </w:r>
     </w:p>
     <w:tbl>
@@ -14027,7 +14027,7 @@
       <w:r>
         <w:drawing>
           <wp:inline xmlns:a="http://schemas.openxmlformats.org/drawingml/2006/main" xmlns:pic="http://schemas.openxmlformats.org/drawingml/2006/picture">
-            <wp:extent cx="6263640" cy="2505456"/>
+            <wp:extent cx="6263640" cy="2745236"/>
             <wp:docPr id="6" name="Picture 6" descr="Figure 6. Left: requests served of 480 in the September 29 held-out matrix by search method, with each method's mean case p95. Right: search p95 by concurrency in the September 24 study, insertion against bounded."/>
             <wp:cNvGraphicFramePr>
               <a:graphicFrameLocks noChangeAspect="1"/>
@@ -14048,7 +14048,7 @@
                   <pic:spPr>
                     <a:xfrm>
                       <a:off x="0" y="0"/>
-                      <a:ext cx="6263640" cy="2505456"/>
+                      <a:ext cx="6263640" cy="2745236"/>
                     </a:xfrm>
                     <a:prstGeom prst="rect"/>
                   </pic:spPr>
@@ -14657,7 +14657,7 @@
       <w:r>
         <w:drawing>
           <wp:inline xmlns:a="http://schemas.openxmlformats.org/drawingml/2006/main" xmlns:pic="http://schemas.openxmlformats.org/drawingml/2006/picture">
-            <wp:extent cx="6263640" cy="2783840"/>
+            <wp:extent cx="6263640" cy="2745236"/>
             <wp:docPr id="7" name="Picture 7" descr="Figure 7. Server time of the median booking call, split into slot wait, routing, calculation engine and database, for the VM baseline (J0), the two J runs, the J2 build that shipped (section 11) and the remote solver pool (section 12). The confirm has almost no work of its own; its bar is the wait behind searches."/>
             <wp:cNvGraphicFramePr>
               <a:graphicFrameLocks noChangeAspect="1"/>
@@ -14678,7 +14678,7 @@
                   <pic:spPr>
                     <a:xfrm>
                       <a:off x="0" y="0"/>
-                      <a:ext cx="6263640" cy="2783840"/>
+                      <a:ext cx="6263640" cy="2745236"/>
                     </a:xfrm>
                     <a:prstGeom prst="rect"/>
                   </pic:spPr>
@@ -14729,7 +14729,7 @@
       <w:r>
         <w:drawing>
           <wp:inline xmlns:a="http://schemas.openxmlformats.org/drawingml/2006/main" xmlns:pic="http://schemas.openxmlformats.org/drawingml/2006/picture">
-            <wp:extent cx="6263640" cy="2505456"/>
+            <wp:extent cx="6263640" cy="2745236"/>
             <wp:docPr id="8" name="Picture 8" descr="Figure 8. p50 of a 16-pair routing request against the routing service alone with its caches off, flexible against CH, on the 2026-09-16 map in September and the 2026-10-13 map on October 14 (the new image routes a request's pairs in parallel). Log scale."/>
             <wp:cNvGraphicFramePr>
               <a:graphicFrameLocks noChangeAspect="1"/>
@@ -14750,7 +14750,7 @@
                   <pic:spPr>
                     <a:xfrm>
                       <a:off x="0" y="0"/>
-                      <a:ext cx="6263640" cy="2505456"/>
+                      <a:ext cx="6263640" cy="2745236"/>
                     </a:xfrm>
                     <a:prstGeom prst="rect"/>
                   </pic:spPr>
@@ -16992,7 +16992,7 @@
       <w:r>
         <w:drawing>
           <wp:inline xmlns:a="http://schemas.openxmlformats.org/drawingml/2006/main" xmlns:pic="http://schemas.openxmlformats.org/drawingml/2006/picture">
-            <wp:extent cx="6263640" cy="2505456"/>
+            <wp:extent cx="6263640" cy="2647367"/>
             <wp:docPr id="9" name="Picture 9" descr="Figure 9. Left: proposals answered (solid) or refused with 503 (hatched) at one and four planners, before and after #153. Middle: proposals each of two clients got in 90 s on one replica, synchronously and queued (#157). Right: proposals in 60 s from one replica doing everything or from booking and daily pools at equal capacity (#158)."/>
             <wp:cNvGraphicFramePr>
               <a:graphicFrameLocks noChangeAspect="1"/>
@@ -17013,7 +17013,7 @@
                   <pic:spPr>
                     <a:xfrm>
                       <a:off x="0" y="0"/>
-                      <a:ext cx="6263640" cy="2505456"/>
+                      <a:ext cx="6263640" cy="2647367"/>
                     </a:xfrm>
                     <a:prstGeom prst="rect"/>
                   </pic:spPr>
@@ -17072,8 +17072,8 @@
       <w:r>
         <w:drawing>
           <wp:inline xmlns:a="http://schemas.openxmlformats.org/drawingml/2006/main" xmlns:pic="http://schemas.openxmlformats.org/drawingml/2006/picture">
-            <wp:extent cx="6263640" cy="2575052"/>
-            <wp:docPr id="10" name="Picture 10" descr="Figure 10. Confirm (left) and offers (right) at the caller, p50 and p95, from J's CH run through the four J2 runs. The small label on each confirm bar is the median slot wait the server recorded for it."/>
+            <wp:extent cx="6263640" cy="2745236"/>
+            <wp:docPr id="10" name="Picture 10" descr="Figure 10. Confirm (left) and offers (right) at the caller, p50 and p95, from J's CH run through the four J2 runs. Hollow dots are p50 and filled dots p95; the WAIT line under each confirm row is the median slot wait the server recorded."/>
             <wp:cNvGraphicFramePr>
               <a:graphicFrameLocks noChangeAspect="1"/>
             </wp:cNvGraphicFramePr>
@@ -17093,7 +17093,7 @@
                   <pic:spPr>
                     <a:xfrm>
                       <a:off x="0" y="0"/>
-                      <a:ext cx="6263640" cy="2575052"/>
+                      <a:ext cx="6263640" cy="2745236"/>
                     </a:xfrm>
                     <a:prstGeom prst="rect"/>
                   </pic:spPr>
@@ -17116,7 +17116,7 @@
           <w:i/>
           <w:color w:val="000000"/>
         </w:rPr>
-        <w:t>Figure 10. Confirm (left) and offers (right) at the caller, p50 and p95, from J's CH run through the four J2 runs. The small label on each confirm bar is the median slot wait the server recorded for it.</w:t>
+        <w:t>Figure 10. Confirm (left) and offers (right) at the caller, p50 and p95, from J's CH run through the four J2 runs. Hollow dots are p50 and filled dots p95; the WAIT line under each confirm row is the median slot wait the server recorded.</w:t>
       </w:r>
     </w:p>
     <w:p>
@@ -17135,8 +17135,8 @@
       <w:r>
         <w:drawing>
           <wp:inline xmlns:a="http://schemas.openxmlformats.org/drawingml/2006/main" xmlns:pic="http://schemas.openxmlformats.org/drawingml/2006/picture">
-            <wp:extent cx="6263640" cy="2575052"/>
-            <wp:docPr id="11" name="Picture 11" descr="Figure 11. Five booking desks at each stage: searches answered per minute (left) and caller latency of offers (right). Left of the dotted line, one machine with the desks alone; right of it, the VM rehearsal stack with five daily planners working beside the desks. The two halves are not one series."/>
+            <wp:extent cx="6263640" cy="2940975"/>
+            <wp:docPr id="11" name="Picture 11" descr="Figure 11. Five booking desks at each stage: searches answered per minute (left) and caller latency of offers as p50 (hollow) and p95 (filled) against the 5.5 s bound (right). Left of the dotted line, one machine with the desks alone; right of it, the VM rehearsal stack with five daily planners working beside the desks. The two halves are not one series."/>
             <wp:cNvGraphicFramePr>
               <a:graphicFrameLocks noChangeAspect="1"/>
             </wp:cNvGraphicFramePr>
@@ -17156,7 +17156,7 @@
                   <pic:spPr>
                     <a:xfrm>
                       <a:off x="0" y="0"/>
-                      <a:ext cx="6263640" cy="2575052"/>
+                      <a:ext cx="6263640" cy="2940975"/>
                     </a:xfrm>
                     <a:prstGeom prst="rect"/>
                   </pic:spPr>
@@ -17179,7 +17179,7 @@
           <w:i/>
           <w:color w:val="000000"/>
         </w:rPr>
-        <w:t>Figure 11. Five booking desks at each stage: searches answered per minute (left) and caller latency of offers (right). Left of the dotted line, one machine with the desks alone; right of it, the VM rehearsal stack with five daily planners working beside the desks. The two halves are not one series.</w:t>
+        <w:t>Figure 11. Five booking desks at each stage: searches answered per minute (left) and caller latency of offers as p50 (hollow) and p95 (filled) against the 5.5 s bound (right). Left of the dotted line, one machine with the desks alone; right of it, the VM rehearsal stack with five daily planners working beside the desks. The two halves are not one series.</w:t>
       </w:r>
     </w:p>
     <w:p>
@@ -17234,7 +17234,7 @@
       <w:r>
         <w:drawing>
           <wp:inline xmlns:a="http://schemas.openxmlformats.org/drawingml/2006/main" xmlns:pic="http://schemas.openxmlformats.org/drawingml/2006/picture">
-            <wp:extent cx="6263640" cy="2644648"/>
+            <wp:extent cx="6263640" cy="2940975"/>
             <wp:docPr id="12" name="Picture 12" descr="Figure 12. Left: each paired case's cost-phase moves per second before (x) and after (y) the RoadMatrix treatment; the dotted line is no change and the dashed line is twice the rate. Right: offers at the caller for the embedded engine and three remote pool configurations in study K, with the daily proposals each pool answered."/>
             <wp:cNvGraphicFramePr>
               <a:graphicFrameLocks noChangeAspect="1"/>
@@ -17255,7 +17255,7 @@
                   <pic:spPr>
                     <a:xfrm>
                       <a:off x="0" y="0"/>
-                      <a:ext cx="6263640" cy="2644648"/>
+                      <a:ext cx="6263640" cy="2940975"/>
                     </a:xfrm>
                     <a:prstGeom prst="rect"/>
                   </pic:spPr>

</xml_diff>